<commit_message>
MEGA PUSH, lots of changes,
</commit_message>
<xml_diff>
--- a/2 - TrueNas.docx
+++ b/2 - TrueNas.docx
@@ -222,13 +222,7 @@
         <w:jc w:val="both"/>
       </w:pPr>
       <w:r>
-        <w:t>3</w:t>
-      </w:r>
-      <w:r>
-        <w:t xml:space="preserve">. </w:t>
-      </w:r>
-      <w:r>
-        <w:t>Tableau explicatif :</w:t>
+        <w:t>3. Tableau explicatif :</w:t>
       </w:r>
     </w:p>
     <w:p>
@@ -3559,7 +3553,6 @@
         <w:ind w:left="400"/>
         <w:jc w:val="both"/>
       </w:pPr>
-      <w:proofErr w:type="gramStart"/>
       <w:r>
         <w:rPr>
           <w:rFonts w:ascii="Courier New" w:eastAsia="Courier New" w:hAnsi="Courier New" w:cs="Courier New"/>
@@ -3567,9 +3560,8 @@
           <w:sz w:val="20"/>
           <w:szCs w:val="20"/>
         </w:rPr>
-        <w:t>net</w:t>
-      </w:r>
-      <w:proofErr w:type="gramEnd"/>
+        <w:t>net use Z: \\192.168.1.XX\backups /user:</w:t>
+      </w:r>
       <w:r>
         <w:rPr>
           <w:rFonts w:ascii="Courier New" w:eastAsia="Courier New" w:hAnsi="Courier New" w:cs="Courier New"/>
@@ -3577,9 +3569,8 @@
           <w:sz w:val="20"/>
           <w:szCs w:val="20"/>
         </w:rPr>
-        <w:t xml:space="preserve"> use </w:t>
-      </w:r>
-      <w:proofErr w:type="gramStart"/>
+        <w:t xml:space="preserve"> NOMU</w:t>
+      </w:r>
       <w:r>
         <w:rPr>
           <w:rFonts w:ascii="Courier New" w:eastAsia="Courier New" w:hAnsi="Courier New" w:cs="Courier New"/>
@@ -3587,9 +3578,8 @@
           <w:sz w:val="20"/>
           <w:szCs w:val="20"/>
         </w:rPr>
-        <w:t>Z:</w:t>
-      </w:r>
-      <w:proofErr w:type="gramEnd"/>
+        <w:t>SER</w:t>
+      </w:r>
       <w:r>
         <w:rPr>
           <w:rFonts w:ascii="Courier New" w:eastAsia="Courier New" w:hAnsi="Courier New" w:cs="Courier New"/>
@@ -3597,9 +3587,9 @@
           <w:sz w:val="20"/>
           <w:szCs w:val="20"/>
         </w:rPr>
-        <w:t xml:space="preserve"> \\192.168.1.XX\backups /</w:t>
-      </w:r>
-      <w:proofErr w:type="gramStart"/>
+        <w:t xml:space="preserve"> MOTDEPASSE /</w:t>
+      </w:r>
+      <w:proofErr w:type="spellStart"/>
       <w:r>
         <w:rPr>
           <w:rFonts w:ascii="Courier New" w:eastAsia="Courier New" w:hAnsi="Courier New" w:cs="Courier New"/>
@@ -3607,49 +3597,9 @@
           <w:sz w:val="20"/>
           <w:szCs w:val="20"/>
         </w:rPr>
-        <w:t>user:</w:t>
-      </w:r>
-      <w:proofErr w:type="gramEnd"/>
-      <w:r>
-        <w:rPr>
-          <w:rFonts w:ascii="Courier New" w:eastAsia="Courier New" w:hAnsi="Courier New" w:cs="Courier New"/>
-          <w:color w:val="333333"/>
-          <w:sz w:val="20"/>
-          <w:szCs w:val="20"/>
-        </w:rPr>
-        <w:t xml:space="preserve"> NOMU</w:t>
-      </w:r>
-      <w:r>
-        <w:rPr>
-          <w:rFonts w:ascii="Courier New" w:eastAsia="Courier New" w:hAnsi="Courier New" w:cs="Courier New"/>
-          <w:color w:val="333333"/>
-          <w:sz w:val="20"/>
-          <w:szCs w:val="20"/>
-        </w:rPr>
-        <w:t>SER</w:t>
-      </w:r>
-      <w:r>
-        <w:rPr>
-          <w:rFonts w:ascii="Courier New" w:eastAsia="Courier New" w:hAnsi="Courier New" w:cs="Courier New"/>
-          <w:color w:val="333333"/>
-          <w:sz w:val="20"/>
-          <w:szCs w:val="20"/>
-        </w:rPr>
-        <w:t xml:space="preserve"> MOTDEPASSE /</w:t>
-      </w:r>
-      <w:proofErr w:type="spellStart"/>
-      <w:proofErr w:type="gramStart"/>
-      <w:r>
-        <w:rPr>
-          <w:rFonts w:ascii="Courier New" w:eastAsia="Courier New" w:hAnsi="Courier New" w:cs="Courier New"/>
-          <w:color w:val="333333"/>
-          <w:sz w:val="20"/>
-          <w:szCs w:val="20"/>
-        </w:rPr>
         <w:t>persistent:yes</w:t>
       </w:r>
       <w:proofErr w:type="spellEnd"/>
-      <w:proofErr w:type="gramEnd"/>
     </w:p>
     <w:p>
       <w:pPr>
@@ -4097,6 +4047,20 @@
       </w:pPr>
     </w:p>
     <w:p>
+      <w:r>
+        <w:br w:type="page"/>
+      </w:r>
+    </w:p>
+    <w:p>
+      <w:pPr>
+        <w:pBdr>
+          <w:bottom w:val="single" w:sz="4" w:space="0" w:color="DDDDDD"/>
+        </w:pBdr>
+        <w:spacing w:before="200" w:after="200"/>
+        <w:jc w:val="both"/>
+      </w:pPr>
+    </w:p>
+    <w:p>
       <w:pPr>
         <w:pStyle w:val="Titre1"/>
         <w:jc w:val="both"/>
@@ -4134,14 +4098,19 @@
         <w:jc w:val="both"/>
       </w:pPr>
       <w:r>
-        <w:lastRenderedPageBreak/>
         <w:t xml:space="preserve">Brancher </w:t>
       </w:r>
       <w:r>
         <w:t>un</w:t>
       </w:r>
       <w:r>
-        <w:t xml:space="preserve"> deuxième disque Toshiba 12 To et configurer un Mirror RAID (redondance des données)</w:t>
+        <w:t xml:space="preserve"> deuxième disqu</w:t>
+      </w:r>
+      <w:r>
+        <w:t>e</w:t>
+      </w:r>
+      <w:r>
+        <w:t xml:space="preserve"> et configurer un Mirror RAID (redondance des données)</w:t>
       </w:r>
     </w:p>
     <w:p>
@@ -4169,16 +4138,7 @@
         <w:jc w:val="both"/>
       </w:pPr>
       <w:r>
-        <w:t>Configurer les sauvegardes des VMs Proxmox vers le dataset 'VMS'</w:t>
-      </w:r>
-    </w:p>
-    <w:p>
-      <w:pPr>
-        <w:pStyle w:val="Titre2"/>
-        <w:jc w:val="both"/>
-      </w:pPr>
-      <w:r>
-        <w:t>Moyen terme</w:t>
+        <w:t>Automatiser le transfert sur le NAS de mes données</w:t>
       </w:r>
     </w:p>
     <w:p>
@@ -4192,9 +4152,20 @@
         <w:jc w:val="both"/>
       </w:pPr>
       <w:r>
-        <w:t>Configurer Wireguard VPN pour accéder au NAS à distance de manière sécurisée</w:t>
-      </w:r>
-    </w:p>
+        <w:t>Configurer les sauvegardes des VMs Proxmox vers le dataset 'VMS'</w:t>
+      </w:r>
+    </w:p>
+    <w:p>
+      <w:pPr>
+        <w:pStyle w:val="Titre2"/>
+        <w:jc w:val="both"/>
+      </w:pPr>
+      <w:r>
+        <w:t>Moyen terme</w:t>
+      </w:r>
+      <w:bookmarkStart w:id="0" w:name="OLE_LINK1"/>
+    </w:p>
+    <w:bookmarkEnd w:id="0"/>
     <w:p>
       <w:pPr>
         <w:pStyle w:val="Paragraphedeliste"/>
@@ -4211,6 +4182,15 @@
     </w:p>
     <w:p>
       <w:pPr>
+        <w:pStyle w:val="Titre2"/>
+        <w:jc w:val="both"/>
+      </w:pPr>
+      <w:r>
+        <w:t>Long terme</w:t>
+      </w:r>
+    </w:p>
+    <w:p>
+      <w:pPr>
         <w:pStyle w:val="Paragraphedeliste"/>
         <w:numPr>
           <w:ilvl w:val="0"/>
@@ -4220,44 +4200,7 @@
         <w:jc w:val="both"/>
       </w:pPr>
       <w:r>
-        <w:t>Explorer les applications TrueNAS (Nextcloud, Plex...)</w:t>
-      </w:r>
-    </w:p>
-    <w:p>
-      <w:pPr>
-        <w:pStyle w:val="Titre2"/>
-        <w:jc w:val="both"/>
-      </w:pPr>
-      <w:r>
-        <w:t>Long terme</w:t>
-      </w:r>
-    </w:p>
-    <w:p>
-      <w:pPr>
-        <w:pStyle w:val="Paragraphedeliste"/>
-        <w:numPr>
-          <w:ilvl w:val="0"/>
-          <w:numId w:val="2"/>
-        </w:numPr>
-        <w:spacing w:before="60" w:after="60"/>
-        <w:jc w:val="both"/>
-      </w:pPr>
-      <w:r>
         <w:t>Intégrer pfSense comme pare-feu réseau</w:t>
-      </w:r>
-    </w:p>
-    <w:p>
-      <w:pPr>
-        <w:pStyle w:val="Paragraphedeliste"/>
-        <w:numPr>
-          <w:ilvl w:val="0"/>
-          <w:numId w:val="2"/>
-        </w:numPr>
-        <w:spacing w:before="60" w:after="60"/>
-        <w:jc w:val="both"/>
-      </w:pPr>
-      <w:r>
-        <w:t>Mettre en place une sauvegarde cloud</w:t>
       </w:r>
     </w:p>
     <w:p>
@@ -4268,606 +4211,6 @@
         <w:spacing w:before="200" w:after="200"/>
         <w:jc w:val="both"/>
       </w:pPr>
-    </w:p>
-    <w:p>
-      <w:pPr>
-        <w:pStyle w:val="Titre1"/>
-        <w:jc w:val="both"/>
-      </w:pPr>
-      <w:r>
-        <w:t>11. Snapshots automatiques sur tous les datasets</w:t>
-      </w:r>
-    </w:p>
-    <w:p>
-      <w:pPr>
-        <w:spacing w:before="100" w:after="100"/>
-        <w:jc w:val="both"/>
-      </w:pPr>
-      <w:r>
-        <w:t>Les snapshots ZFS sont des photos instantanées des données à un moment précis. En cas de suppression accidentelle ou de corruption d’un fichier, il est possible de le restaurer depuis un snapshot sans perte. ZFS les gère de manière très efficace sans dupliquer les données.</w:t>
-      </w:r>
-    </w:p>
-    <w:p>
-      <w:pPr>
-        <w:pStyle w:val="Titre2"/>
-        <w:jc w:val="both"/>
-      </w:pPr>
-      <w:r>
-        <w:t>11.1 Chemin de configuration</w:t>
-      </w:r>
-    </w:p>
-    <w:p>
-      <w:pPr>
-        <w:spacing w:before="80" w:after="80"/>
-        <w:ind w:left="400"/>
-        <w:jc w:val="both"/>
-      </w:pPr>
-      <w:r>
-        <w:rPr>
-          <w:rFonts w:ascii="Courier New" w:hAnsi="Courier New"/>
-          <w:sz w:val="20"/>
-        </w:rPr>
-        <w:t>Data Protection → Periodic Snapshot Tasks → Add</w:t>
-      </w:r>
-    </w:p>
-    <w:p>
-      <w:pPr>
-        <w:pStyle w:val="Titre2"/>
-        <w:jc w:val="both"/>
-      </w:pPr>
-      <w:r>
-        <w:t>11.2 Tâches configurées</w:t>
-      </w:r>
-    </w:p>
-    <w:p>
-      <w:pPr>
-        <w:spacing w:before="100" w:after="100"/>
-        <w:jc w:val="both"/>
-      </w:pPr>
-      <w:r>
-        <w:t>Quatre tâches de snapshot ont été créées, une par dataset :</w:t>
-      </w:r>
-    </w:p>
-    <w:tbl>
-      <w:tblPr>
-        <w:tblW w:w="9360" w:type="dxa"/>
-        <w:tblBorders>
-          <w:top w:val="single" w:sz="1" w:space="0" w:color="CCCCCC"/>
-          <w:left w:val="single" w:sz="1" w:space="0" w:color="CCCCCC"/>
-          <w:bottom w:val="single" w:sz="1" w:space="0" w:color="CCCCCC"/>
-          <w:right w:val="single" w:sz="1" w:space="0" w:color="CCCCCC"/>
-          <w:insideH w:val="single" w:sz="1" w:space="0" w:color="CCCCCC"/>
-          <w:insideV w:val="single" w:sz="1" w:space="0" w:color="CCCCCC"/>
-        </w:tblBorders>
-        <w:tblLook w:val="04A0" w:firstRow="1" w:lastRow="0" w:firstColumn="1" w:lastColumn="0" w:noHBand="0" w:noVBand="1"/>
-      </w:tblPr>
-      <w:tblGrid>
-        <w:gridCol w:w="2500"/>
-        <w:gridCol w:w="2000"/>
-        <w:gridCol w:w="2000"/>
-        <w:gridCol w:w="2860"/>
-      </w:tblGrid>
-      <w:tr>
-        <w:tc>
-          <w:tcPr>
-            <w:tcW w:w="2500" w:type="dxa"/>
-            <w:shd w:val="clear" w:color="auto" w:fill="1F4E79"/>
-            <w:tcMar>
-              <w:top w:w="80" w:type="dxa"/>
-              <w:left w:w="120" w:type="dxa"/>
-              <w:bottom w:w="80" w:type="dxa"/>
-              <w:right w:w="120" w:type="dxa"/>
-            </w:tcMar>
-          </w:tcPr>
-          <w:p>
-            <w:pPr>
-              <w:jc w:val="both"/>
-            </w:pPr>
-            <w:r>
-              <w:rPr>
-                <w:b/>
-                <w:color w:val="FFFFFF"/>
-                <w:sz w:val="20"/>
-              </w:rPr>
-              <w:t>Dataset</w:t>
-            </w:r>
-          </w:p>
-        </w:tc>
-        <w:tc>
-          <w:tcPr>
-            <w:tcW w:w="2000" w:type="dxa"/>
-            <w:shd w:val="clear" w:color="auto" w:fill="1F4E79"/>
-            <w:tcMar>
-              <w:top w:w="80" w:type="dxa"/>
-              <w:left w:w="120" w:type="dxa"/>
-              <w:bottom w:w="80" w:type="dxa"/>
-              <w:right w:w="120" w:type="dxa"/>
-            </w:tcMar>
-          </w:tcPr>
-          <w:p>
-            <w:pPr>
-              <w:jc w:val="both"/>
-            </w:pPr>
-            <w:r>
-              <w:rPr>
-                <w:b/>
-                <w:color w:val="FFFFFF"/>
-                <w:sz w:val="20"/>
-              </w:rPr>
-              <w:t>Fréquence</w:t>
-            </w:r>
-          </w:p>
-        </w:tc>
-        <w:tc>
-          <w:tcPr>
-            <w:tcW w:w="2000" w:type="dxa"/>
-            <w:shd w:val="clear" w:color="auto" w:fill="1F4E79"/>
-            <w:tcMar>
-              <w:top w:w="80" w:type="dxa"/>
-              <w:left w:w="120" w:type="dxa"/>
-              <w:bottom w:w="80" w:type="dxa"/>
-              <w:right w:w="120" w:type="dxa"/>
-            </w:tcMar>
-          </w:tcPr>
-          <w:p>
-            <w:pPr>
-              <w:jc w:val="both"/>
-            </w:pPr>
-            <w:r>
-              <w:rPr>
-                <w:b/>
-                <w:color w:val="FFFFFF"/>
-                <w:sz w:val="20"/>
-              </w:rPr>
-              <w:t>Conservation</w:t>
-            </w:r>
-          </w:p>
-        </w:tc>
-        <w:tc>
-          <w:tcPr>
-            <w:tcW w:w="2860" w:type="dxa"/>
-            <w:shd w:val="clear" w:color="auto" w:fill="1F4E79"/>
-            <w:tcMar>
-              <w:top w:w="80" w:type="dxa"/>
-              <w:left w:w="120" w:type="dxa"/>
-              <w:bottom w:w="80" w:type="dxa"/>
-              <w:right w:w="120" w:type="dxa"/>
-            </w:tcMar>
-          </w:tcPr>
-          <w:p>
-            <w:pPr>
-              <w:jc w:val="both"/>
-            </w:pPr>
-            <w:r>
-              <w:rPr>
-                <w:b/>
-                <w:color w:val="FFFFFF"/>
-                <w:sz w:val="20"/>
-              </w:rPr>
-              <w:t>Heure</w:t>
-            </w:r>
-          </w:p>
-        </w:tc>
-      </w:tr>
-      <w:tr>
-        <w:tc>
-          <w:tcPr>
-            <w:tcW w:w="2500" w:type="dxa"/>
-            <w:tcMar>
-              <w:top w:w="80" w:type="dxa"/>
-              <w:left w:w="120" w:type="dxa"/>
-              <w:bottom w:w="80" w:type="dxa"/>
-              <w:right w:w="120" w:type="dxa"/>
-            </w:tcMar>
-          </w:tcPr>
-          <w:p>
-            <w:pPr>
-              <w:jc w:val="both"/>
-            </w:pPr>
-            <w:r>
-              <w:rPr>
-                <w:sz w:val="20"/>
-              </w:rPr>
-              <w:t>datapool/documents</w:t>
-            </w:r>
-          </w:p>
-        </w:tc>
-        <w:tc>
-          <w:tcPr>
-            <w:tcW w:w="2000" w:type="dxa"/>
-            <w:tcMar>
-              <w:top w:w="80" w:type="dxa"/>
-              <w:left w:w="120" w:type="dxa"/>
-              <w:bottom w:w="80" w:type="dxa"/>
-              <w:right w:w="120" w:type="dxa"/>
-            </w:tcMar>
-          </w:tcPr>
-          <w:p>
-            <w:pPr>
-              <w:jc w:val="both"/>
-            </w:pPr>
-            <w:r>
-              <w:rPr>
-                <w:sz w:val="20"/>
-              </w:rPr>
-              <w:t>Quotidienne</w:t>
-            </w:r>
-          </w:p>
-        </w:tc>
-        <w:tc>
-          <w:tcPr>
-            <w:tcW w:w="2000" w:type="dxa"/>
-            <w:tcMar>
-              <w:top w:w="80" w:type="dxa"/>
-              <w:left w:w="120" w:type="dxa"/>
-              <w:bottom w:w="80" w:type="dxa"/>
-              <w:right w:w="120" w:type="dxa"/>
-            </w:tcMar>
-          </w:tcPr>
-          <w:p>
-            <w:pPr>
-              <w:jc w:val="both"/>
-            </w:pPr>
-            <w:r>
-              <w:rPr>
-                <w:sz w:val="20"/>
-              </w:rPr>
-              <w:t>2 semaines</w:t>
-            </w:r>
-          </w:p>
-        </w:tc>
-        <w:tc>
-          <w:tcPr>
-            <w:tcW w:w="2860" w:type="dxa"/>
-            <w:tcMar>
-              <w:top w:w="80" w:type="dxa"/>
-              <w:left w:w="120" w:type="dxa"/>
-              <w:bottom w:w="80" w:type="dxa"/>
-              <w:right w:w="120" w:type="dxa"/>
-            </w:tcMar>
-          </w:tcPr>
-          <w:p>
-            <w:pPr>
-              <w:jc w:val="both"/>
-            </w:pPr>
-            <w:r>
-              <w:rPr>
-                <w:sz w:val="20"/>
-              </w:rPr>
-              <w:t>00:00</w:t>
-            </w:r>
-          </w:p>
-        </w:tc>
-      </w:tr>
-      <w:tr>
-        <w:tc>
-          <w:tcPr>
-            <w:tcW w:w="2500" w:type="dxa"/>
-            <w:tcMar>
-              <w:top w:w="80" w:type="dxa"/>
-              <w:left w:w="120" w:type="dxa"/>
-              <w:bottom w:w="80" w:type="dxa"/>
-              <w:right w:w="120" w:type="dxa"/>
-            </w:tcMar>
-          </w:tcPr>
-          <w:p>
-            <w:pPr>
-              <w:jc w:val="both"/>
-            </w:pPr>
-            <w:r>
-              <w:rPr>
-                <w:sz w:val="20"/>
-              </w:rPr>
-              <w:t>datapool/backups</w:t>
-            </w:r>
-          </w:p>
-        </w:tc>
-        <w:tc>
-          <w:tcPr>
-            <w:tcW w:w="2000" w:type="dxa"/>
-            <w:tcMar>
-              <w:top w:w="80" w:type="dxa"/>
-              <w:left w:w="120" w:type="dxa"/>
-              <w:bottom w:w="80" w:type="dxa"/>
-              <w:right w:w="120" w:type="dxa"/>
-            </w:tcMar>
-          </w:tcPr>
-          <w:p>
-            <w:pPr>
-              <w:jc w:val="both"/>
-            </w:pPr>
-            <w:r>
-              <w:rPr>
-                <w:sz w:val="20"/>
-              </w:rPr>
-              <w:t>Quotidienne</w:t>
-            </w:r>
-          </w:p>
-        </w:tc>
-        <w:tc>
-          <w:tcPr>
-            <w:tcW w:w="2000" w:type="dxa"/>
-            <w:tcMar>
-              <w:top w:w="80" w:type="dxa"/>
-              <w:left w:w="120" w:type="dxa"/>
-              <w:bottom w:w="80" w:type="dxa"/>
-              <w:right w:w="120" w:type="dxa"/>
-            </w:tcMar>
-          </w:tcPr>
-          <w:p>
-            <w:pPr>
-              <w:jc w:val="both"/>
-            </w:pPr>
-            <w:r>
-              <w:rPr>
-                <w:sz w:val="20"/>
-              </w:rPr>
-              <w:t>1 mois</w:t>
-            </w:r>
-          </w:p>
-        </w:tc>
-        <w:tc>
-          <w:tcPr>
-            <w:tcW w:w="2860" w:type="dxa"/>
-            <w:tcMar>
-              <w:top w:w="80" w:type="dxa"/>
-              <w:left w:w="120" w:type="dxa"/>
-              <w:bottom w:w="80" w:type="dxa"/>
-              <w:right w:w="120" w:type="dxa"/>
-            </w:tcMar>
-          </w:tcPr>
-          <w:p>
-            <w:pPr>
-              <w:jc w:val="both"/>
-            </w:pPr>
-            <w:r>
-              <w:rPr>
-                <w:sz w:val="20"/>
-              </w:rPr>
-              <w:t>01:00</w:t>
-            </w:r>
-          </w:p>
-        </w:tc>
-      </w:tr>
-      <w:tr>
-        <w:tc>
-          <w:tcPr>
-            <w:tcW w:w="2500" w:type="dxa"/>
-            <w:tcMar>
-              <w:top w:w="80" w:type="dxa"/>
-              <w:left w:w="120" w:type="dxa"/>
-              <w:bottom w:w="80" w:type="dxa"/>
-              <w:right w:w="120" w:type="dxa"/>
-            </w:tcMar>
-          </w:tcPr>
-          <w:p>
-            <w:pPr>
-              <w:jc w:val="both"/>
-            </w:pPr>
-            <w:r>
-              <w:rPr>
-                <w:sz w:val="20"/>
-              </w:rPr>
-              <w:t>datapool/media</w:t>
-            </w:r>
-          </w:p>
-        </w:tc>
-        <w:tc>
-          <w:tcPr>
-            <w:tcW w:w="2000" w:type="dxa"/>
-            <w:tcMar>
-              <w:top w:w="80" w:type="dxa"/>
-              <w:left w:w="120" w:type="dxa"/>
-              <w:bottom w:w="80" w:type="dxa"/>
-              <w:right w:w="120" w:type="dxa"/>
-            </w:tcMar>
-          </w:tcPr>
-          <w:p>
-            <w:pPr>
-              <w:jc w:val="both"/>
-            </w:pPr>
-            <w:r>
-              <w:rPr>
-                <w:sz w:val="20"/>
-              </w:rPr>
-              <w:t>Hebdomadaire</w:t>
-            </w:r>
-          </w:p>
-        </w:tc>
-        <w:tc>
-          <w:tcPr>
-            <w:tcW w:w="2000" w:type="dxa"/>
-            <w:tcMar>
-              <w:top w:w="80" w:type="dxa"/>
-              <w:left w:w="120" w:type="dxa"/>
-              <w:bottom w:w="80" w:type="dxa"/>
-              <w:right w:w="120" w:type="dxa"/>
-            </w:tcMar>
-          </w:tcPr>
-          <w:p>
-            <w:pPr>
-              <w:jc w:val="both"/>
-            </w:pPr>
-            <w:r>
-              <w:rPr>
-                <w:sz w:val="20"/>
-              </w:rPr>
-              <w:t>1 mois</w:t>
-            </w:r>
-          </w:p>
-        </w:tc>
-        <w:tc>
-          <w:tcPr>
-            <w:tcW w:w="2860" w:type="dxa"/>
-            <w:tcMar>
-              <w:top w:w="80" w:type="dxa"/>
-              <w:left w:w="120" w:type="dxa"/>
-              <w:bottom w:w="80" w:type="dxa"/>
-              <w:right w:w="120" w:type="dxa"/>
-            </w:tcMar>
-          </w:tcPr>
-          <w:p>
-            <w:pPr>
-              <w:jc w:val="both"/>
-            </w:pPr>
-            <w:r>
-              <w:rPr>
-                <w:sz w:val="20"/>
-              </w:rPr>
-              <w:t>02:00</w:t>
-            </w:r>
-          </w:p>
-        </w:tc>
-      </w:tr>
-      <w:tr>
-        <w:tc>
-          <w:tcPr>
-            <w:tcW w:w="2500" w:type="dxa"/>
-            <w:tcMar>
-              <w:top w:w="80" w:type="dxa"/>
-              <w:left w:w="120" w:type="dxa"/>
-              <w:bottom w:w="80" w:type="dxa"/>
-              <w:right w:w="120" w:type="dxa"/>
-            </w:tcMar>
-          </w:tcPr>
-          <w:p>
-            <w:pPr>
-              <w:jc w:val="both"/>
-            </w:pPr>
-            <w:r>
-              <w:rPr>
-                <w:sz w:val="20"/>
-              </w:rPr>
-              <w:t>datapool/vms</w:t>
-            </w:r>
-          </w:p>
-        </w:tc>
-        <w:tc>
-          <w:tcPr>
-            <w:tcW w:w="2000" w:type="dxa"/>
-            <w:tcMar>
-              <w:top w:w="80" w:type="dxa"/>
-              <w:left w:w="120" w:type="dxa"/>
-              <w:bottom w:w="80" w:type="dxa"/>
-              <w:right w:w="120" w:type="dxa"/>
-            </w:tcMar>
-          </w:tcPr>
-          <w:p>
-            <w:pPr>
-              <w:jc w:val="both"/>
-            </w:pPr>
-            <w:r>
-              <w:rPr>
-                <w:sz w:val="20"/>
-              </w:rPr>
-              <w:t>Quotidienne</w:t>
-            </w:r>
-          </w:p>
-        </w:tc>
-        <w:tc>
-          <w:tcPr>
-            <w:tcW w:w="2000" w:type="dxa"/>
-            <w:tcMar>
-              <w:top w:w="80" w:type="dxa"/>
-              <w:left w:w="120" w:type="dxa"/>
-              <w:bottom w:w="80" w:type="dxa"/>
-              <w:right w:w="120" w:type="dxa"/>
-            </w:tcMar>
-          </w:tcPr>
-          <w:p>
-            <w:pPr>
-              <w:jc w:val="both"/>
-            </w:pPr>
-            <w:r>
-              <w:rPr>
-                <w:sz w:val="20"/>
-              </w:rPr>
-              <w:t>2 semaines</w:t>
-            </w:r>
-          </w:p>
-        </w:tc>
-        <w:tc>
-          <w:tcPr>
-            <w:tcW w:w="2860" w:type="dxa"/>
-            <w:tcMar>
-              <w:top w:w="80" w:type="dxa"/>
-              <w:left w:w="120" w:type="dxa"/>
-              <w:bottom w:w="80" w:type="dxa"/>
-              <w:right w:w="120" w:type="dxa"/>
-            </w:tcMar>
-          </w:tcPr>
-          <w:p>
-            <w:pPr>
-              <w:jc w:val="both"/>
-            </w:pPr>
-            <w:r>
-              <w:rPr>
-                <w:sz w:val="20"/>
-              </w:rPr>
-              <w:t>03:00</w:t>
-            </w:r>
-          </w:p>
-        </w:tc>
-      </w:tr>
-    </w:tbl>
-    <w:p>
-      <w:pPr>
-        <w:spacing w:before="100" w:after="100"/>
-        <w:ind w:left="400"/>
-        <w:jc w:val="both"/>
-      </w:pPr>
-      <w:r>
-        <w:rPr>
-          <w:color w:val="155724"/>
-        </w:rPr>
-        <w:t>✅  Les snapshots s’exécutent automatiquement chaque nuit. Pour restaurer un fichier : Storage → Snapshots → Clone ou Rollback.</w:t>
-      </w:r>
-    </w:p>
-    <w:p>
-      <w:pPr>
-        <w:pStyle w:val="Titre1"/>
-        <w:jc w:val="both"/>
-      </w:pPr>
-    </w:p>
-    <w:p>
-      <w:pPr>
-        <w:pStyle w:val="Titre1"/>
-        <w:jc w:val="both"/>
-      </w:pPr>
-    </w:p>
-    <w:p>
-      <w:pPr>
-        <w:pStyle w:val="Titre1"/>
-        <w:jc w:val="both"/>
-      </w:pPr>
-    </w:p>
-    <w:p>
-      <w:pPr>
-        <w:pStyle w:val="Titre1"/>
-        <w:jc w:val="both"/>
-      </w:pPr>
-      <w:r>
-        <w:lastRenderedPageBreak/>
-        <w:t>Conclusion</w:t>
-      </w:r>
-    </w:p>
-    <w:p>
-      <w:pPr>
-        <w:spacing w:before="100" w:after="100"/>
-        <w:jc w:val="both"/>
-      </w:pPr>
-      <w:r>
-        <w:t>Ce projet a permis de mettre en place un NAS professionnel sur infrastructure Proxmox avec TrueNAS Scale. Malgré plusieurs difficultés techniques (Secure Boot, serial Numbers dupliqués, permissions SMB), chaque problème a été résolu méthodiquement.</w:t>
-      </w:r>
-    </w:p>
-    <w:p>
-      <w:pPr>
-        <w:spacing w:before="100" w:after="100"/>
-        <w:jc w:val="both"/>
-      </w:pPr>
-      <w:r>
-        <w:t>L'infrastructure finale offre 12 To de stockage en RAID 0 accessible depuis le réseau local via SMB, avec des sauvegardes automatiques depuis Windows et une protection par snapshots ZFS. Elle est extensible avec un deuxième disque pour la redondance RAID.</w:t>
-      </w:r>
     </w:p>
     <w:p>
       <w:pPr>

</xml_diff>